<commit_message>
Add updated CV files in multiple formats with revised contact information and enhanced project details
</commit_message>
<xml_diff>
--- a/latestCV/React/Maninder-Singh-Full-Stack-Developer.docx
+++ b/latestCV/React/Maninder-Singh-Full-Stack-Developer.docx
@@ -79,26 +79,6 @@
           <w:rFonts w:ascii="Calibri" w:cs="Calibri" w:eastAsia="Calibri" w:hAnsi="Calibri"/>
         </w:rPr>
         <w:t xml:space="preserve">maninder6005@gmail.com</w:t>
-      </w:r>
-      <w:r>
-        <w:rPr>
-          <w:color w:val="B4A7D6"/>
-          <w:sz w:val="20"/>
-          <w:szCs w:val="20"/>
-          <w:rFonts w:ascii="Calibri" w:cs="Calibri" w:eastAsia="Calibri" w:hAnsi="Calibri"/>
-        </w:rPr>
-        <w:t xml:space="preserve">  |  </w:t>
-      </w:r>
-      <w:r>
-        <w:rPr>
-          <w:b/>
-          <w:bCs/>
-          <w:color w:val="333333"/>
-          <w:sz w:val="20"/>
-          <w:szCs w:val="20"/>
-          <w:rFonts w:ascii="Calibri" w:cs="Calibri" w:eastAsia="Calibri" w:hAnsi="Calibri"/>
-        </w:rPr>
-        <w:t xml:space="preserve">linkedin.com/in/maninder0000</w:t>
       </w:r>
       <w:r>
         <w:rPr>

</xml_diff>